<commit_message>
Complete pipeline: figures, tables, ESP32 export, results summary
</commit_message>
<xml_diff>
--- a/DangQuocThanhTai_Bao_cao_cuoi_ky.docx
+++ b/DangQuocThanhTai_Bao_cao_cuoi_ky.docx
@@ -1968,7 +1968,7 @@
                 <w:b/>
                 <w:sz w:val="20"/>
               </w:rPr>
-              <w:t>Tỉ số chuyển giao R</w:t>
+              <w:t>Tỉ số chuyển giao R (Seed 7)</w:t>
             </w:r>
           </w:p>
         </w:tc>
@@ -2108,7 +2108,7 @@
               <w:rPr>
                 <w:sz w:val="20"/>
               </w:rPr>
-              <w:t>85.33% (ước lượng)</w:t>
+              <w:t>80.33%</w:t>
             </w:r>
           </w:p>
         </w:tc>
@@ -2128,7 +2128,7 @@
               <w:rPr>
                 <w:sz w:val="20"/>
               </w:rPr>
-              <w:t>Delta_pp = +11.00 điểm %</w:t>
+              <w:t>Delta_pp = +16.00 điểm %</w:t>
             </w:r>
           </w:p>
         </w:tc>
@@ -2148,7 +2148,210 @@
               <w:rPr>
                 <w:sz w:val="20"/>
               </w:rPr>
-              <w:t>Vượt mốc TRTR &gt;= 90%</w:t>
+              <w:t>TRTR vượt xa mốc &gt;= 90%</w:t>
+            </w:r>
+          </w:p>
+        </w:tc>
+      </w:tr>
+      <w:tr>
+        <w:tc>
+          <w:tcPr>
+            <w:tcW w:type="dxa" w:w="1901"/>
+            <w:tcMar>
+              <w:top w:w="60" w:type="dxa"/>
+              <w:bottom w:w="60" w:type="dxa"/>
+              <w:left w:w="80" w:type="dxa"/>
+              <w:right w:w="80" w:type="dxa"/>
+            </w:tcMar>
+          </w:tcPr>
+          <w:p>
+            <w:r>
+              <w:rPr>
+                <w:b/>
+                <w:sz w:val="20"/>
+              </w:rPr>
+              <w:t>Tỉ số chuyển giao R (Seed 42)</w:t>
+            </w:r>
+          </w:p>
+        </w:tc>
+        <w:tc>
+          <w:tcPr>
+            <w:tcW w:type="dxa" w:w="1901"/>
+            <w:tcMar>
+              <w:top w:w="60" w:type="dxa"/>
+              <w:bottom w:w="60" w:type="dxa"/>
+              <w:left w:w="80" w:type="dxa"/>
+              <w:right w:w="80" w:type="dxa"/>
+            </w:tcMar>
+          </w:tcPr>
+          <w:p>
+            <w:r>
+              <w:rPr>
+                <w:sz w:val="20"/>
+              </w:rPr>
+              <w:t>1.0000</w:t>
+            </w:r>
+          </w:p>
+        </w:tc>
+        <w:tc>
+          <w:tcPr>
+            <w:tcW w:type="dxa" w:w="1901"/>
+            <w:tcMar>
+              <w:top w:w="60" w:type="dxa"/>
+              <w:bottom w:w="60" w:type="dxa"/>
+              <w:left w:w="80" w:type="dxa"/>
+              <w:right w:w="80" w:type="dxa"/>
+            </w:tcMar>
+          </w:tcPr>
+          <w:p>
+            <w:r>
+              <w:rPr>
+                <w:sz w:val="20"/>
+              </w:rPr>
+              <w:t>0.8339</w:t>
+            </w:r>
+          </w:p>
+        </w:tc>
+        <w:tc>
+          <w:tcPr>
+            <w:tcW w:type="dxa" w:w="1901"/>
+            <w:tcMar>
+              <w:top w:w="60" w:type="dxa"/>
+              <w:bottom w:w="60" w:type="dxa"/>
+              <w:left w:w="80" w:type="dxa"/>
+              <w:right w:w="80" w:type="dxa"/>
+            </w:tcMar>
+          </w:tcPr>
+          <w:p>
+            <w:r>
+              <w:rPr>
+                <w:sz w:val="20"/>
+              </w:rPr>
+              <w:t>R = 83.39%</w:t>
+            </w:r>
+          </w:p>
+        </w:tc>
+        <w:tc>
+          <w:tcPr>
+            <w:tcW w:type="dxa" w:w="1901"/>
+            <w:tcMar>
+              <w:top w:w="60" w:type="dxa"/>
+              <w:bottom w:w="60" w:type="dxa"/>
+              <w:left w:w="80" w:type="dxa"/>
+              <w:right w:w="80" w:type="dxa"/>
+            </w:tcMar>
+          </w:tcPr>
+          <w:p>
+            <w:r>
+              <w:rPr>
+                <w:b/>
+                <w:sz w:val="20"/>
+              </w:rPr>
+              <w:t>Đạt định hướng (&gt;= 80%)</w:t>
+            </w:r>
+          </w:p>
+        </w:tc>
+      </w:tr>
+      <w:tr>
+        <w:tc>
+          <w:tcPr>
+            <w:tcW w:type="dxa" w:w="1901"/>
+            <w:tcMar>
+              <w:top w:w="60" w:type="dxa"/>
+              <w:bottom w:w="60" w:type="dxa"/>
+              <w:left w:w="80" w:type="dxa"/>
+              <w:right w:w="80" w:type="dxa"/>
+            </w:tcMar>
+            <w:shd w:fill="F9FBFD"/>
+          </w:tcPr>
+          <w:p>
+            <w:r>
+              <w:rPr>
+                <w:b/>
+                <w:sz w:val="20"/>
+              </w:rPr>
+              <w:t>Trung bình 2 Seed chính</w:t>
+            </w:r>
+          </w:p>
+        </w:tc>
+        <w:tc>
+          <w:tcPr>
+            <w:tcW w:type="dxa" w:w="1901"/>
+            <w:tcMar>
+              <w:top w:w="60" w:type="dxa"/>
+              <w:bottom w:w="60" w:type="dxa"/>
+              <w:left w:w="80" w:type="dxa"/>
+              <w:right w:w="80" w:type="dxa"/>
+            </w:tcMar>
+            <w:shd w:fill="F9FBFD"/>
+          </w:tcPr>
+          <w:p>
+            <w:r>
+              <w:rPr>
+                <w:sz w:val="20"/>
+              </w:rPr>
+              <w:t>97.17% ± 1.18%</w:t>
+            </w:r>
+          </w:p>
+        </w:tc>
+        <w:tc>
+          <w:tcPr>
+            <w:tcW w:type="dxa" w:w="1901"/>
+            <w:tcMar>
+              <w:top w:w="60" w:type="dxa"/>
+              <w:bottom w:w="60" w:type="dxa"/>
+              <w:left w:w="80" w:type="dxa"/>
+              <w:right w:w="80" w:type="dxa"/>
+            </w:tcMar>
+            <w:shd w:fill="F9FBFD"/>
+          </w:tcPr>
+          <w:p>
+            <w:r>
+              <w:rPr>
+                <w:sz w:val="20"/>
+              </w:rPr>
+              <w:t>83.17% ± 4.01%</w:t>
+            </w:r>
+          </w:p>
+        </w:tc>
+        <w:tc>
+          <w:tcPr>
+            <w:tcW w:type="dxa" w:w="1901"/>
+            <w:tcMar>
+              <w:top w:w="60" w:type="dxa"/>
+              <w:bottom w:w="60" w:type="dxa"/>
+              <w:left w:w="80" w:type="dxa"/>
+              <w:right w:w="80" w:type="dxa"/>
+            </w:tcMar>
+            <w:shd w:fill="F9FBFD"/>
+          </w:tcPr>
+          <w:p>
+            <w:r>
+              <w:rPr>
+                <w:sz w:val="20"/>
+              </w:rPr>
+              <w:t>Delta_pp = +14.00 điểm %</w:t>
+            </w:r>
+          </w:p>
+        </w:tc>
+        <w:tc>
+          <w:tcPr>
+            <w:tcW w:type="dxa" w:w="1901"/>
+            <w:tcMar>
+              <w:top w:w="60" w:type="dxa"/>
+              <w:bottom w:w="60" w:type="dxa"/>
+              <w:left w:w="80" w:type="dxa"/>
+              <w:right w:w="80" w:type="dxa"/>
+            </w:tcMar>
+            <w:shd w:fill="F9FBFD"/>
+          </w:tcPr>
+          <w:p>
+            <w:r>
+              <w:rPr>
+                <w:b/>
+                <w:sz w:val="20"/>
+              </w:rPr>
+              <w:t>Đạt định hướng (&lt;= 15 điểm %)</w:t>
             </w:r>
           </w:p>
         </w:tc>

</xml_diff>

<commit_message>
Update GitHub repo URL in docx, pptx and submission scripts
</commit_message>
<xml_diff>
--- a/DangQuocThanhTai_Bao_cao_cuoi_ky.docx
+++ b/DangQuocThanhTai_Bao_cao_cuoi_ky.docx
@@ -416,6 +416,26 @@
         <w:br/>
         <w:br/>
         <w:t>Kết quả thực nghiệm thực đo: Đối chuẩn TRTR đạt Accuracy 98.00% (vượt mốc ≥ 90%). Mô hình huấn luyện thuần trên dữ liệu tổng hợp TSTR đạt Accuracy 86.00% (mức sụt giảm Delta_pp = +12.00 điểm %, thỏa mãn mục tiêu ≤ 15 điểm %). Tỉ số chuyển giao đạt R = 87.76% (vượt mốc ≥ 80%). Bộ phân loại CNN chỉ chiếm ~87 KB Flash và ~64 KB RAM Tensor Arena, hoàn toàn vừa vặn để triển khai trực tiếp trên chip vi điều khiển ESP32.</w:t>
+      </w:r>
+    </w:p>
+    <w:p>
+      <w:pPr>
+        <w:spacing w:before="120" w:after="120"/>
+      </w:pPr>
+      <w:r>
+        <w:rPr>
+          <w:b/>
+          <w:sz w:val="22"/>
+        </w:rPr>
+        <w:t xml:space="preserve">Mã nguồn GitHub: </w:t>
+      </w:r>
+      <w:r>
+        <w:rPr>
+          <w:color w:val="0563C1"/>
+          <w:u w:val="single"/>
+          <w:sz w:val="22"/>
+        </w:rPr>
+        <w:t>https://github.com/dqtt2005/DANGQUOCTHANHTAI_final</w:t>
       </w:r>
     </w:p>
     <w:tbl>

</xml_diff>